<commit_message>
Updating paths in docs
</commit_message>
<xml_diff>
--- a/docs/CCSI Compressor User Manual.docx
+++ b/docs/CCSI Compressor User Manual.docx
@@ -297,7 +297,7 @@
           <w:noProof/>
         </w:rPr>
         <w:drawing>
-          <wp:anchor distT="0" distB="0" distL="114300" distR="114300" simplePos="0" relativeHeight="251660288" behindDoc="0" locked="0" layoutInCell="1" allowOverlap="1" wp14:anchorId="10999063" wp14:editId="4543355B">
+          <wp:anchor distT="0" distB="0" distL="114300" distR="114300" simplePos="0" relativeHeight="251660288" behindDoc="0" locked="0" layoutInCell="1" allowOverlap="1" wp14:anchorId="10999063" wp14:editId="4D4DDC2C">
             <wp:simplePos x="0" y="0"/>
             <wp:positionH relativeFrom="column">
               <wp:posOffset>4240530</wp:posOffset>
@@ -513,7 +513,10 @@
         <w:pStyle w:val="URSCover18ptBlueFont"/>
       </w:pPr>
       <w:r>
-        <w:t>February 2025</w:t>
+        <w:t>March</w:t>
+      </w:r>
+      <w:r>
+        <w:t xml:space="preserve"> 2025</w:t>
       </w:r>
     </w:p>
     <w:p>
@@ -802,7 +805,14 @@
         <w:rPr>
           <w:rFonts w:ascii="Arial" w:eastAsia="Arial" w:hAnsi="Arial" w:cs="Arial"/>
         </w:rPr>
-        <w:t xml:space="preserve">Neither the name of the Carbon Capture Simulation Initiative, U.S. Dept. of Energy, the National Energy Technology Laboratory, Oak Ridge Institute for Science and Education (ORISE), Los Alamos National Security, LLC., </w:t>
+        <w:t xml:space="preserve">Neither the name of the Carbon Capture Simulation Initiative, U.S. Dept. of Energy, the National Energy Technology Laboratory, Oak Ridge Institute for Science and Education </w:t>
+      </w:r>
+      <w:r>
+        <w:rPr>
+          <w:rFonts w:ascii="Arial" w:eastAsia="Arial" w:hAnsi="Arial" w:cs="Arial"/>
+        </w:rPr>
+        <w:lastRenderedPageBreak/>
+        <w:t xml:space="preserve">(ORISE), Los Alamos National Security, LLC., </w:t>
       </w:r>
       <w:r>
         <w:rPr>
@@ -866,6 +876,7 @@
         <w:pStyle w:val="TOCHeading"/>
       </w:pPr>
       <w:r>
+        <w:lastRenderedPageBreak/>
         <w:t>Table of Contents</w:t>
       </w:r>
     </w:p>
@@ -5592,6 +5603,7 @@
       <w:bookmarkStart w:id="0" w:name="_Toc509932380"/>
       <w:bookmarkStart w:id="1" w:name="_Toc433811324"/>
       <w:r>
+        <w:lastRenderedPageBreak/>
         <w:t xml:space="preserve">CCSI </w:t>
       </w:r>
       <w:r>
@@ -5627,6 +5639,7 @@
       <w:bookmarkStart w:id="4" w:name="_Toc398559477"/>
       <w:bookmarkStart w:id="5" w:name="_Toc509932381"/>
       <w:r>
+        <w:lastRenderedPageBreak/>
         <w:t>Reporting Issues</w:t>
       </w:r>
       <w:bookmarkEnd w:id="2"/>
@@ -5842,7 +5855,16 @@
               <w:pStyle w:val="URSTableTextLeft"/>
             </w:pPr>
             <w:r>
-              <w:t>2/28/2025</w:t>
+              <w:t>3</w:t>
+            </w:r>
+            <w:r>
+              <w:t>/</w:t>
+            </w:r>
+            <w:r>
+              <w:t>31</w:t>
+            </w:r>
+            <w:r>
+              <w:t>/2025</w:t>
             </w:r>
           </w:p>
         </w:tc>
@@ -6168,6 +6190,7 @@
           <w:sz w:val="24"/>
           <w:szCs w:val="24"/>
         </w:rPr>
+        <w:lastRenderedPageBreak/>
         <mc:AlternateContent>
           <mc:Choice Requires="wps">
             <w:drawing>
@@ -6485,6 +6508,7 @@
       <w:bookmarkStart w:id="14" w:name="_Toc400906905"/>
       <w:bookmarkStart w:id="15" w:name="_Toc509932386"/>
       <w:r>
+        <w:lastRenderedPageBreak/>
         <w:t>Dimensionless Numbers</w:t>
       </w:r>
       <w:bookmarkEnd w:id="13"/>
@@ -8265,6 +8289,7 @@
       <w:bookmarkStart w:id="17" w:name="_Toc400906906"/>
       <w:bookmarkStart w:id="18" w:name="_Toc509932387"/>
       <w:r>
+        <w:lastRenderedPageBreak/>
         <w:t>Efficiency</w:t>
       </w:r>
       <w:bookmarkEnd w:id="16"/>
@@ -9732,6 +9757,7 @@
       <w:bookmarkStart w:id="20" w:name="_Toc400906907"/>
       <w:bookmarkStart w:id="21" w:name="_Toc509932388"/>
       <w:r>
+        <w:lastRenderedPageBreak/>
         <w:t>Constraints</w:t>
       </w:r>
       <w:bookmarkEnd w:id="19"/>
@@ -10971,6 +10997,7 @@
         <w:pageBreakBefore/>
       </w:pPr>
       <w:r>
+        <w:lastRenderedPageBreak/>
         <w:t>If Equation 12 is applied to the stages of an integral gear compressor, the Ma numbers calculated from a typical industrial integral gear compressor can be compared. Figure 69 shows the result. The low estimate and high estimate are from L</w:t>
       </w:r>
       <w:r>
@@ -11499,6 +11526,7 @@
       <w:bookmarkStart w:id="27" w:name="_Toc400906908"/>
       <w:bookmarkStart w:id="28" w:name="_Toc509932389"/>
       <w:r>
+        <w:lastRenderedPageBreak/>
         <w:t>Multi-Stage Compressors</w:t>
       </w:r>
       <w:bookmarkEnd w:id="26"/>
@@ -11575,6 +11603,7 @@
       <w:bookmarkStart w:id="36" w:name="_Toc400906911"/>
       <w:bookmarkStart w:id="37" w:name="_Toc509932392"/>
       <w:r>
+        <w:lastRenderedPageBreak/>
         <w:t>TEG CO</w:t>
       </w:r>
       <w:r>
@@ -11817,6 +11846,7 @@
       <w:bookmarkStart w:id="41" w:name="_Toc400906912"/>
       <w:bookmarkStart w:id="42" w:name="_Toc509932393"/>
       <w:r>
+        <w:lastRenderedPageBreak/>
         <w:t>Property Methods</w:t>
       </w:r>
       <w:bookmarkEnd w:id="40"/>
@@ -13206,6 +13236,7 @@
               <w:pStyle w:val="URSTableTextLeft"/>
             </w:pPr>
             <w:r>
+              <w:lastRenderedPageBreak/>
               <w:t>Aspen/Hysis Glycol</w:t>
             </w:r>
           </w:p>
@@ -13476,6 +13507,7 @@
       <w:bookmarkStart w:id="51" w:name="_Toc400906914"/>
       <w:bookmarkStart w:id="52" w:name="_Toc509932395"/>
       <w:r>
+        <w:lastRenderedPageBreak/>
         <w:t xml:space="preserve">Drying, </w:t>
       </w:r>
       <w:r>
@@ -13627,6 +13659,7 @@
         <w:pageBreakBefore/>
       </w:pPr>
       <w:r>
+        <w:lastRenderedPageBreak/>
         <w:t>Figure 73 shows the solubility of CO</w:t>
       </w:r>
       <w:r>
@@ -13731,6 +13764,7 @@
       <w:bookmarkStart w:id="58" w:name="_Toc400906915"/>
       <w:bookmarkStart w:id="59" w:name="_Toc509932396"/>
       <w:r>
+        <w:lastRenderedPageBreak/>
         <w:t>ACM Model</w:t>
       </w:r>
       <w:bookmarkEnd w:id="57"/>
@@ -13926,6 +13960,7 @@
       <w:bookmarkStart w:id="67" w:name="_Toc400906918"/>
       <w:bookmarkStart w:id="68" w:name="_Toc509932399"/>
       <w:r>
+        <w:lastRenderedPageBreak/>
         <w:t>Multistage Compressor Models</w:t>
       </w:r>
       <w:bookmarkEnd w:id="66"/>
@@ -14068,6 +14103,7 @@
       <w:bookmarkStart w:id="73" w:name="_Toc400906920"/>
       <w:bookmarkStart w:id="74" w:name="_Toc509932401"/>
       <w:r>
+        <w:lastRenderedPageBreak/>
         <w:t>Integral Gear Compressor with Drier Simulation</w:t>
       </w:r>
       <w:bookmarkEnd w:id="72"/>
@@ -14208,6 +14244,7 @@
         <w:pageBreakBefore/>
       </w:pPr>
       <w:r>
+        <w:lastRenderedPageBreak/>
         <w:t>The flowsheet variables “teg_flow” and “water_content” are used to control the water content of the CO</w:t>
       </w:r>
       <w:r>
@@ -14405,6 +14442,7 @@
       <w:bookmarkStart w:id="83" w:name="_Toc400906922"/>
       <w:bookmarkStart w:id="84" w:name="_Toc509932403"/>
       <w:r>
+        <w:lastRenderedPageBreak/>
         <w:t>Results</w:t>
       </w:r>
       <w:bookmarkEnd w:id="82"/>
@@ -14865,6 +14903,7 @@
       <w:bookmarkStart w:id="90" w:name="_Toc432672565"/>
       <w:bookmarkStart w:id="91" w:name="_Toc509932462"/>
       <w:r>
+        <w:lastRenderedPageBreak/>
         <w:t xml:space="preserve">Table </w:t>
       </w:r>
       <w:fldSimple w:instr=" SEQ Table \* ARABIC ">
@@ -16354,6 +16393,7 @@
         <w:pageBreakBefore/>
       </w:pPr>
       <w:r>
+        <w:lastRenderedPageBreak/>
         <w:t>Table</w:t>
       </w:r>
       <w:r>
@@ -18831,6 +18871,7 @@
       </w:pPr>
       <w:bookmarkStart w:id="103" w:name="_Toc335724026"/>
       <w:r>
+        <w:lastRenderedPageBreak/>
         <w:t>Inline</w:t>
       </w:r>
       <w:bookmarkEnd w:id="103"/>
@@ -20635,6 +20676,7 @@
       <w:bookmarkStart w:id="107" w:name="_Toc509932406"/>
       <w:bookmarkStart w:id="108" w:name="_Toc335724027"/>
       <w:r>
+        <w:lastRenderedPageBreak/>
         <w:t>D</w:t>
       </w:r>
       <w:r>
@@ -21120,6 +21162,7 @@
         <w:rPr>
           <w:lang w:bidi="en-US"/>
         </w:rPr>
+        <w:lastRenderedPageBreak/>
         <w:t>Performance Curves</w:t>
       </w:r>
       <w:bookmarkEnd w:id="109"/>
@@ -23732,7 +23775,14 @@
         <w:rPr>
           <w:lang w:bidi="en-US"/>
         </w:rPr>
-        <w:t xml:space="preserve"> represents the performance curves of Stage 1 for different IGV openings. The legends in the figure represent the angle of the vanes. The X-axis represents the dimensionless inlet flow coefficient and the Y-axis represents the dimensionless isentropic head coefficient. For all the performance curves, correlations have been developed between </w:t>
+        <w:t xml:space="preserve"> represents the performance curves of Stage 1 for different IGV openings. The legends in the figure represent the angle of the vanes. The X-axis </w:t>
+      </w:r>
+      <w:r>
+        <w:rPr>
+          <w:lang w:bidi="en-US"/>
+        </w:rPr>
+        <w:lastRenderedPageBreak/>
+        <w:t xml:space="preserve">represents the dimensionless inlet flow coefficient and the Y-axis represents the dimensionless isentropic head coefficient. For all the performance curves, correlations have been developed between </w:t>
       </w:r>
       <m:oMath>
         <m:sSub>
@@ -25378,6 +25428,7 @@
         </w:rPr>
       </w:pPr>
       <w:r>
+        <w:lastRenderedPageBreak/>
         <w:drawing>
           <wp:inline distT="0" distB="0" distL="0" distR="0" wp14:anchorId="1B344A8C" wp14:editId="401CA970">
             <wp:extent cx="5365972" cy="4097216"/>
@@ -26254,6 +26305,7 @@
         <w:rPr>
           <w:lang w:bidi="en-US"/>
         </w:rPr>
+        <w:lastRenderedPageBreak/>
         <w:t>A similar estimation technique is followed for other stages. The regressed parameters corresponding</w:t>
       </w:r>
       <w:r>
@@ -27923,14 +27975,8 @@
         <w:rPr>
           <w:lang w:bidi="en-US"/>
         </w:rPr>
+        <w:lastRenderedPageBreak/>
         <w:t xml:space="preserve">The gain-scheduling controller was developed using an adaptive </w:t>
-      </w:r>
-      <w:r>
-        <w:rPr>
-          <w:noProof/>
-          <w:position w:val="-6"/>
-          <w:lang w:bidi="en-US"/>
-        </w:rPr>
       </w:r>
       <w:r>
         <w:rPr>
@@ -27958,10 +28004,10 @@
             <v:path o:extrusionok="f" gradientshapeok="t" o:connecttype="rect"/>
             <o:lock v:ext="edit" aspectratio="t"/>
           </v:shapetype>
-          <v:shape id="_x0000_i1025" type="#_x0000_t75" alt="" style="width:11.25pt;height:13.15pt;mso-width-percent:0;mso-height-percent:0;mso-width-percent:0;mso-height-percent:0" o:ole="">
+          <v:shape id="_x0000_i1030" type="#_x0000_t75" alt="" style="width:11.1pt;height:12.75pt;mso-width-percent:0;mso-height-percent:0;mso-width-percent:0;mso-height-percent:0" o:ole="">
             <v:imagedata r:id="rId33" o:title=""/>
           </v:shape>
-          <o:OLEObject Type="Embed" ProgID="Equation.DSMT4" ShapeID="_x0000_i1025" DrawAspect="Content" ObjectID="_1800185740" r:id="rId34"/>
+          <o:OLEObject Type="Embed" ProgID="Equation.DSMT4" ShapeID="_x0000_i1030" DrawAspect="Content" ObjectID="_1803218136" r:id="rId34"/>
         </w:object>
       </w:r>
       <w:r>
@@ -28269,18 +28315,11 @@
           <w:position w:val="-6"/>
           <w:lang w:bidi="en-US"/>
         </w:rPr>
-      </w:r>
-      <w:r>
-        <w:rPr>
-          <w:noProof/>
-          <w:position w:val="-6"/>
-          <w:lang w:bidi="en-US"/>
-        </w:rPr>
         <w:object w:dxaOrig="220" w:dyaOrig="220" w14:anchorId="528E5AD0">
-          <v:shape id="_x0000_i1026" type="#_x0000_t75" alt="" style="width:10pt;height:10pt;mso-width-percent:0;mso-height-percent:0;mso-width-percent:0;mso-height-percent:0" o:ole="">
+          <v:shape id="_x0000_i1029" type="#_x0000_t75" alt="" style="width:9.95pt;height:9.95pt;mso-width-percent:0;mso-height-percent:0;mso-width-percent:0;mso-height-percent:0" o:ole="">
             <v:imagedata r:id="rId37" o:title=""/>
           </v:shape>
-          <o:OLEObject Type="Embed" ProgID="Equation.DSMT4" ShapeID="_x0000_i1026" DrawAspect="Content" ObjectID="_1800185741" r:id="rId38"/>
+          <o:OLEObject Type="Embed" ProgID="Equation.DSMT4" ShapeID="_x0000_i1029" DrawAspect="Content" ObjectID="_1803218137" r:id="rId38"/>
         </w:object>
       </w:r>
       <w:r>
@@ -28298,6 +28337,7 @@
       <w:bookmarkStart w:id="121" w:name="OLE_LINK7"/>
       <w:bookmarkStart w:id="122" w:name="OLE_LINK8"/>
       <w:r>
+        <w:lastRenderedPageBreak/>
         <w:t xml:space="preserve">ACM </w:t>
       </w:r>
       <w:r>
@@ -28334,7 +28374,13 @@
         <w:t>named</w:t>
       </w:r>
       <w:r>
-        <w:t xml:space="preserve"> “CO2_COMPRESSION_SYSTEM/Dynamic</w:t>
+        <w:t xml:space="preserve"> “</w:t>
+      </w:r>
+      <w:r>
+        <w:t>compressor</w:t>
+      </w:r>
+      <w:r>
+        <w:t>/Dynamic</w:t>
       </w:r>
       <w:r>
         <w:t>.</w:t>
@@ -28406,7 +28452,10 @@
         <w:t>“</w:t>
       </w:r>
       <w:r>
-        <w:t>CO2_COMPRESSION_SYSTEM/Dynamic/,</w:t>
+        <w:t>compressor</w:t>
+      </w:r>
+      <w:r>
+        <w:t>/Dynamic/,</w:t>
       </w:r>
       <w:r>
         <w:t>”</w:t>
@@ -28645,6 +28694,7 @@
         <w:pageBreakBefore/>
       </w:pPr>
       <w:r>
+        <w:lastRenderedPageBreak/>
         <w:t>In the following example, the dynamic model mentioned above is augmented with a script to automatically initiate a ramp change in CO</w:t>
       </w:r>
       <w:r>
@@ -28704,7 +28754,10 @@
         <w:t>“</w:t>
       </w:r>
       <w:r>
-        <w:t>CO2_COMPRESSION_SYSTEM/Dynamic/Example_Flowrate</w:t>
+        <w:t>compressor</w:t>
+      </w:r>
+      <w:r>
+        <w:t>/Dynamic/Example_Flowrate</w:t>
       </w:r>
       <w:r>
         <w:t>.”</w:t>
@@ -28767,7 +28820,10 @@
         <w:t>“</w:t>
       </w:r>
       <w:r>
-        <w:t>CO2_COMPRESSION_SYSTEM/Dynamic/Example_Flowrate,</w:t>
+        <w:t>compressor</w:t>
+      </w:r>
+      <w:r>
+        <w:t>/Dynamic/Example_Flowrate,</w:t>
       </w:r>
       <w:r>
         <w:t>”</w:t>
@@ -29039,6 +29095,7 @@
         <w:pageBreakBefore/>
       </w:pPr>
       <w:r>
+        <w:lastRenderedPageBreak/>
         <w:t>Pressure</w:t>
       </w:r>
     </w:p>
@@ -29248,6 +29305,7 @@
         <w:pStyle w:val="URSNormalBold"/>
       </w:pPr>
       <w:r>
+        <w:lastRenderedPageBreak/>
         <w:t>Temperature</w:t>
       </w:r>
     </w:p>
@@ -29459,6 +29517,7 @@
         <w:pageBreakBefore/>
       </w:pPr>
       <w:r>
+        <w:lastRenderedPageBreak/>
         <w:t>gPROMS Dynamic Simulation</w:t>
       </w:r>
     </w:p>
@@ -29477,7 +29536,10 @@
         <w:t>named</w:t>
       </w:r>
       <w:r>
-        <w:t xml:space="preserve"> “CO2_COMPRESSION_SYSTEM</w:t>
+        <w:t xml:space="preserve"> “</w:t>
+      </w:r>
+      <w:r>
+        <w:t>compressor</w:t>
       </w:r>
       <w:r>
         <w:t>/DYNAMICS/gPROMS</w:t>
@@ -29545,13 +29607,12 @@
       <w:pPr>
         <w:pStyle w:val="URSFigurePhotoCenter"/>
       </w:pPr>
-      <w:r/>
       <w:r>
         <w:object w:dxaOrig="13575" w:dyaOrig="11025" w14:anchorId="235431C7">
-          <v:shape id="_x0000_i1027" type="#_x0000_t75" alt="" style="width:460.15pt;height:373.75pt;mso-width-percent:0;mso-height-percent:0;mso-width-percent:0;mso-height-percent:0" o:ole="">
+          <v:shape id="_x0000_i1028" type="#_x0000_t75" alt="" style="width:460.25pt;height:373.85pt;mso-width-percent:0;mso-height-percent:0;mso-width-percent:0;mso-height-percent:0" o:ole="">
             <v:imagedata r:id="rId43" o:title=""/>
           </v:shape>
-          <o:OLEObject Type="Embed" ProgID="PBrush" ShapeID="_x0000_i1027" DrawAspect="Content" ObjectID="_1800185742" r:id="rId44"/>
+          <o:OLEObject Type="Embed" ProgID="PBrush" ShapeID="_x0000_i1028" DrawAspect="Content" ObjectID="_1803218138" r:id="rId44"/>
         </w:object>
       </w:r>
     </w:p>
@@ -29690,6 +29751,7 @@
         <w:pageBreakBefore/>
       </w:pPr>
       <w:r>
+        <w:lastRenderedPageBreak/>
         <w:t xml:space="preserve">Run the model by clicking “Play” (the green button on the top of the toolbar). The “Simulate” option menu displays. Be sure the check box for “Use steady-state initial conditions” is cleared (see Figure 82). The model is setup to automatically select initial conditions. Additionally, be sure to select the “Send results trajectory to gRMS” check box. This sends the results of the simulation to gPROMS data management software, where templates for plotting the results have already been provided. Lastly, ensure that the “Ignore schedule and intrinsic tasks” check box is left cleared. This runs the schedule already set up (it introduces a disturbance) which can be viewed by opening the “CO2_process_flowsheet_full” under the “Processes” folder in the “project tree” and then navigating to the “Schedule” tab. Select the check box to run a </w:t>
       </w:r>
       <w:r>
@@ -30025,13 +30087,12 @@
           </mc:Fallback>
         </mc:AlternateContent>
       </w:r>
-      <w:r/>
       <w:r>
         <w:object w:dxaOrig="14145" w:dyaOrig="9735" w14:anchorId="1BFF8E56">
-          <v:shape id="_x0000_i1028" type="#_x0000_t75" alt="" style="width:467.05pt;height:323.05pt;mso-width-percent:0;mso-height-percent:0;mso-width-percent:0;mso-height-percent:0" o:ole="">
+          <v:shape id="_x0000_i1027" type="#_x0000_t75" alt="" style="width:466.9pt;height:323.45pt;mso-width-percent:0;mso-height-percent:0;mso-width-percent:0;mso-height-percent:0" o:ole="">
             <v:imagedata r:id="rId45" o:title=""/>
           </v:shape>
-          <o:OLEObject Type="Embed" ProgID="PBrush" ShapeID="_x0000_i1028" DrawAspect="Content" ObjectID="_1800185743" r:id="rId46"/>
+          <o:OLEObject Type="Embed" ProgID="PBrush" ShapeID="_x0000_i1027" DrawAspect="Content" ObjectID="_1803218139" r:id="rId46"/>
         </w:object>
       </w:r>
     </w:p>
@@ -30156,7 +30217,13 @@
         <w:t xml:space="preserve">. </w:t>
       </w:r>
       <w:r>
-        <w:t>The “Initialisation Procedure”</w:t>
+        <w:t>The “</w:t>
+      </w:r>
+      <w:r>
+        <w:t>Initialization</w:t>
+      </w:r>
+      <w:r>
+        <w:t xml:space="preserve"> Procedure”</w:t>
       </w:r>
       <w:r>
         <w:br/>
@@ -30208,6 +30275,7 @@
         <w:pageBreakBefore/>
       </w:pPr>
       <w:r>
+        <w:lastRenderedPageBreak/>
         <w:t>Click “OK” on the “Simulate” options window to begin the simulation.</w:t>
       </w:r>
     </w:p>
@@ -30247,13 +30315,12 @@
       <w:pPr>
         <w:pStyle w:val="URSFigurePhotoCenter"/>
       </w:pPr>
-      <w:r/>
       <w:r>
         <w:object w:dxaOrig="5955" w:dyaOrig="6225" w14:anchorId="20D13234">
-          <v:shape id="_x0000_i1029" type="#_x0000_t75" alt="" style="width:298pt;height:311.8pt;mso-width-percent:0;mso-height-percent:0;mso-width-percent:0;mso-height-percent:0" o:ole="">
+          <v:shape id="_x0000_i1026" type="#_x0000_t75" alt="" style="width:297.95pt;height:311.8pt;mso-width-percent:0;mso-height-percent:0;mso-width-percent:0;mso-height-percent:0" o:ole="">
             <v:imagedata r:id="rId47" o:title=""/>
           </v:shape>
-          <o:OLEObject Type="Embed" ProgID="PBrush" ShapeID="_x0000_i1029" DrawAspect="Content" ObjectID="_1800185744" r:id="rId48"/>
+          <o:OLEObject Type="Embed" ProgID="PBrush" ShapeID="_x0000_i1026" DrawAspect="Content" ObjectID="_1803218140" r:id="rId48"/>
         </w:object>
       </w:r>
       <w:r>
@@ -30347,6 +30414,7 @@
         <w:pStyle w:val="URSNormalBold"/>
       </w:pPr>
       <w:r>
+        <w:lastRenderedPageBreak/>
         <w:t>Pressure</w:t>
       </w:r>
     </w:p>
@@ -30534,6 +30602,7 @@
         </w:rPr>
       </w:pPr>
       <w:r>
+        <w:lastRenderedPageBreak/>
         <w:t>Temperature</w:t>
       </w:r>
       <w:r>
@@ -30732,6 +30801,7 @@
       <w:bookmarkStart w:id="155" w:name="_Toc400906928"/>
       <w:bookmarkStart w:id="156" w:name="_Toc509932409"/>
       <w:r>
+        <w:lastRenderedPageBreak/>
         <w:t>References</w:t>
       </w:r>
       <w:bookmarkEnd w:id="108"/>
@@ -30817,13 +30887,6 @@
           <w:color w:val="000000" w:themeColor="text1"/>
         </w:rPr>
         <w:t xml:space="preserve">“Universal </w:t>
-      </w:r>
-      <w:r>
-        <w:rPr>
-          <w:noProof/>
-          <w:position w:val="-6"/>
-          <w:lang w:bidi="en-US"/>
-        </w:rPr>
       </w:r>
       <w:r>
         <w:rPr>
@@ -30832,10 +30895,10 @@
           <w:lang w:bidi="en-US"/>
         </w:rPr>
         <w:object w:dxaOrig="200" w:dyaOrig="260" w14:anchorId="4C4C86A8">
-          <v:shape id="_x0000_i1030" type="#_x0000_t75" alt="" style="width:11.25pt;height:13.15pt;mso-width-percent:0;mso-height-percent:0;mso-width-percent:0;mso-height-percent:0" o:ole="">
+          <v:shape id="_x0000_i1025" type="#_x0000_t75" alt="" style="width:11.1pt;height:12.75pt;mso-width-percent:0;mso-height-percent:0;mso-width-percent:0;mso-height-percent:0" o:ole="">
             <v:imagedata r:id="rId33" o:title=""/>
           </v:shape>
-          <o:OLEObject Type="Embed" ProgID="Equation.DSMT4" ShapeID="_x0000_i1030" DrawAspect="Content" ObjectID="_1800185745" r:id="rId53"/>
+          <o:OLEObject Type="Embed" ProgID="Equation.DSMT4" ShapeID="_x0000_i1025" DrawAspect="Content" ObjectID="_1803218141" r:id="rId53"/>
         </w:object>
       </w:r>
       <w:r>

</xml_diff>